<commit_message>
Updated few things regarding timestamp
</commit_message>
<xml_diff>
--- a/docs/Architecture.docx
+++ b/docs/Architecture.docx
@@ -124,7 +124,7 @@
         <w:br/>
         <w:t xml:space="preserve">   │  MCP Server   │◄──────►│  incidents-historical  │  (GenAI-owned index)</w:t>
         <w:br/>
-        <w:t xml:space="preserve">   │  6 tools      │        └───────────────────────┘</w:t>
+        <w:t xml:space="preserve">   │  5 tools      │        └───────────────────────┘</w:t>
         <w:br/>
         <w:t xml:space="preserve">   └──────┬────────┘</w:t>
         <w:br/>
@@ -158,7 +158,7 @@
           <w:i/>
           <w:color w:val="555555"/>
         </w:rPr>
-        <w:t>Every data-access path — reads and the one write-back — goes through the MCP server. The LLM never queries OpenSearch or Postgres directly; it only reasons over evidence the MCP tools retrieved. This keeps the system testable, auditable, and swappable.</w:t>
+        <w:t>Every data-access path — reads and the one write-back — goes through the MCP server. The LLM never queries OpenSearch directly; it only reasons over evidence the MCP tools retrieved. This keeps the system testable, auditable, and swappable.</w:t>
       </w:r>
     </w:p>
     <w:p>
@@ -476,28 +476,6 @@
           </w:tcPr>
           <w:p>
             <w:r>
-              <w:t>Business data</w:t>
-            </w:r>
-          </w:p>
-        </w:tc>
-        <w:tc>
-          <w:tcPr>
-            <w:tcW w:type="dxa" w:w="6480"/>
-          </w:tcPr>
-          <w:p>
-            <w:r>
-              <w:t>Postgres (optional, per-project — order/payment/shipment lookups)</w:t>
-            </w:r>
-          </w:p>
-        </w:tc>
-      </w:tr>
-      <w:tr>
-        <w:tc>
-          <w:tcPr>
-            <w:tcW w:type="dxa" w:w="3168"/>
-          </w:tcPr>
-          <w:p>
-            <w:r>
               <w:t>Session / monitor state</w:t>
             </w:r>
           </w:p>
@@ -596,7 +574,7 @@
           </w:tcPr>
           <w:p>
             <w:r>
-              <w:t>MCP-pattern HTTP tools (6), convertible to official MCP stdio/SSE protocol</w:t>
+              <w:t>MCP-pattern HTTP tools (5), convertible to official MCP stdio/SSE protocol</w:t>
             </w:r>
           </w:p>
         </w:tc>
@@ -696,6 +674,26 @@
           <w:i w:val="0"/>
         </w:rPr>
         <w:t>Rather than relying on pre-built chunks (which only a GenAI-owned ingestor could produce), correlation happens live: search for the entity as text, then expand via loggingId. This makes the system portable to any index with the same field shape, with zero pre-processing step to maintain.</w:t>
+      </w:r>
+    </w:p>
+    <w:p>
+      <w:pPr>
+        <w:pStyle w:val="Heading2"/>
+      </w:pPr>
+      <w:r>
+        <w:rPr>
+          <w:color w:val="2C5F7C"/>
+        </w:rPr>
+        <w:t>Time-window scoping to prevent token explosion</w:t>
+      </w:r>
+    </w:p>
+    <w:p>
+      <w:r>
+        <w:rPr>
+          <w:b w:val="0"/>
+          <w:i w:val="0"/>
+        </w:rPr>
+        <w:t>An order that fails repeatedly across days would produce many distinct loggingId traces, all matching the anchor search. Without scoping, every historical failure trace for that order would be concatenated into the LLM prompt — a token explosion. The fix is two-part: (1) the router LLM extracts a date or time hint from the user's natural-language message ("on 7th July", "yesterday", "around 2pm") and converts it to an ISO datetime range that narrows the OpenSearch filter to that window; (2) MAX_TRACES is capped at 3, so even within a single day at most 3 failure traces are returned. Without a date in the message, the default look-back is 24 hours. Users do not need to type ISO dates — natural language is resolved at query time.</w:t>
       </w:r>
     </w:p>
     <w:p>

</xml_diff>